<commit_message>
Syllabus in Word: a CO's column before Hours; template rebuilt to match
The syllabus download and the Syllabus Template (earlier batches) share one
layout, now with each module's COs, as the portal's syllabus sheet has.

Co-Authored-By: Claude Opus 5.5 <noreply@anthropic.com>
Claude-Session: https://claude.ai/code/session_01AFbV5fRvBgtMQjW1oSWr4U
</commit_message>
<xml_diff>
--- a/app/static/templates/Syllabus_Template.docx
+++ b/app/static/templates/Syllabus_Template.docx
@@ -74,13 +74,14 @@
       <w:tblGrid>
         <w:gridCol w:w="2891"/>
         <w:gridCol w:w="3470"/>
-        <w:gridCol w:w="3277"/>
+        <w:gridCol w:w="1735"/>
+        <w:gridCol w:w="1542"/>
       </w:tblGrid>
       <w:tr>
         <w:tc>
           <w:tcPr>
             <w:tcW w:type="dxa" w:w="9638"/>
-            <w:gridSpan w:val="3"/>
+            <w:gridSpan w:val="4"/>
           </w:tcPr>
           <w:p>
             <w:pPr>
@@ -186,6 +187,7 @@
         <w:tc>
           <w:tcPr>
             <w:tcW w:type="dxa" w:w="3277"/>
+            <w:gridSpan w:val="2"/>
           </w:tcPr>
           <w:p>
             <w:pPr>
@@ -246,6 +248,7 @@
         <w:tc>
           <w:tcPr>
             <w:tcW w:type="dxa" w:w="3277"/>
+            <w:gridSpan w:val="2"/>
           </w:tcPr>
           <w:p>
             <w:pPr>
@@ -267,7 +270,7 @@
         <w:tc>
           <w:tcPr>
             <w:tcW w:type="dxa" w:w="9638"/>
-            <w:gridSpan w:val="3"/>
+            <w:gridSpan w:val="4"/>
           </w:tcPr>
           <w:p>
             <w:pPr>
@@ -294,7 +297,7 @@
         <w:tc>
           <w:tcPr>
             <w:tcW w:type="dxa" w:w="9638"/>
-            <w:gridSpan w:val="3"/>
+            <w:gridSpan w:val="4"/>
           </w:tcPr>
           <w:p>
             <w:pPr>
@@ -406,7 +409,27 @@
         </w:tc>
         <w:tc>
           <w:tcPr>
-            <w:tcW w:type="dxa" w:w="3277"/>
+            <w:tcW w:type="dxa" w:w="1735"/>
+          </w:tcPr>
+          <w:p>
+            <w:pPr>
+              <w:spacing w:after="20" w:before="20"/>
+              <w:jc w:val="center"/>
+            </w:pPr>
+            <w:r/>
+            <w:r>
+              <w:rPr>
+                <w:b/>
+                <w:i w:val="0"/>
+                <w:sz w:val="20"/>
+              </w:rPr>
+              <w:t>CO's</w:t>
+            </w:r>
+          </w:p>
+        </w:tc>
+        <w:tc>
+          <w:tcPr>
+            <w:tcW w:type="dxa" w:w="1542"/>
           </w:tcPr>
           <w:p>
             <w:pPr>
@@ -442,13 +465,33 @@
                 <w:i w:val="0"/>
                 <w:sz w:val="20"/>
               </w:rPr>
-              <w:t>Module No. 1: &lt;Title of module 1&gt; (CO's: &lt;CO1, CO2&gt;)</w:t>
-            </w:r>
-          </w:p>
-        </w:tc>
-        <w:tc>
-          <w:tcPr>
-            <w:tcW w:type="dxa" w:w="3277"/>
+              <w:t>Module No. 1: &lt;Title of module 1&gt;</w:t>
+            </w:r>
+          </w:p>
+        </w:tc>
+        <w:tc>
+          <w:tcPr>
+            <w:tcW w:type="dxa" w:w="1735"/>
+          </w:tcPr>
+          <w:p>
+            <w:pPr>
+              <w:spacing w:after="20" w:before="20"/>
+              <w:jc w:val="center"/>
+            </w:pPr>
+            <w:r/>
+            <w:r>
+              <w:rPr>
+                <w:b w:val="0"/>
+                <w:i w:val="0"/>
+                <w:sz w:val="20"/>
+              </w:rPr>
+              <w:t>&lt;CO1&gt;, &lt;CO2&gt;</w:t>
+            </w:r>
+          </w:p>
+        </w:tc>
+        <w:tc>
+          <w:tcPr>
+            <w:tcW w:type="dxa" w:w="1542"/>
           </w:tcPr>
           <w:p>
             <w:pPr>
@@ -470,7 +513,7 @@
         <w:tc>
           <w:tcPr>
             <w:tcW w:type="dxa" w:w="9638"/>
-            <w:gridSpan w:val="3"/>
+            <w:gridSpan w:val="4"/>
           </w:tcPr>
           <w:p>
             <w:pPr>
@@ -506,13 +549,33 @@
                 <w:i w:val="0"/>
                 <w:sz w:val="20"/>
               </w:rPr>
-              <w:t>Module No. 2: &lt;Title of module 2&gt; (CO's: &lt;CO1, CO2&gt;)</w:t>
-            </w:r>
-          </w:p>
-        </w:tc>
-        <w:tc>
-          <w:tcPr>
-            <w:tcW w:type="dxa" w:w="3277"/>
+              <w:t>Module No. 2: &lt;Title of module 2&gt;</w:t>
+            </w:r>
+          </w:p>
+        </w:tc>
+        <w:tc>
+          <w:tcPr>
+            <w:tcW w:type="dxa" w:w="1735"/>
+          </w:tcPr>
+          <w:p>
+            <w:pPr>
+              <w:spacing w:after="20" w:before="20"/>
+              <w:jc w:val="center"/>
+            </w:pPr>
+            <w:r/>
+            <w:r>
+              <w:rPr>
+                <w:b w:val="0"/>
+                <w:i w:val="0"/>
+                <w:sz w:val="20"/>
+              </w:rPr>
+              <w:t>&lt;CO1&gt;, &lt;CO2&gt;</w:t>
+            </w:r>
+          </w:p>
+        </w:tc>
+        <w:tc>
+          <w:tcPr>
+            <w:tcW w:type="dxa" w:w="1542"/>
           </w:tcPr>
           <w:p>
             <w:pPr>
@@ -534,7 +597,7 @@
         <w:tc>
           <w:tcPr>
             <w:tcW w:type="dxa" w:w="9638"/>
-            <w:gridSpan w:val="3"/>
+            <w:gridSpan w:val="4"/>
           </w:tcPr>
           <w:p>
             <w:pPr>
@@ -570,13 +633,33 @@
                 <w:i w:val="0"/>
                 <w:sz w:val="20"/>
               </w:rPr>
-              <w:t>Module No. 3: &lt;Title of module 3&gt; (CO's: &lt;CO1, CO2&gt;)</w:t>
-            </w:r>
-          </w:p>
-        </w:tc>
-        <w:tc>
-          <w:tcPr>
-            <w:tcW w:type="dxa" w:w="3277"/>
+              <w:t>Module No. 3: &lt;Title of module 3&gt;</w:t>
+            </w:r>
+          </w:p>
+        </w:tc>
+        <w:tc>
+          <w:tcPr>
+            <w:tcW w:type="dxa" w:w="1735"/>
+          </w:tcPr>
+          <w:p>
+            <w:pPr>
+              <w:spacing w:after="20" w:before="20"/>
+              <w:jc w:val="center"/>
+            </w:pPr>
+            <w:r/>
+            <w:r>
+              <w:rPr>
+                <w:b w:val="0"/>
+                <w:i w:val="0"/>
+                <w:sz w:val="20"/>
+              </w:rPr>
+              <w:t>&lt;CO1&gt;, &lt;CO2&gt;</w:t>
+            </w:r>
+          </w:p>
+        </w:tc>
+        <w:tc>
+          <w:tcPr>
+            <w:tcW w:type="dxa" w:w="1542"/>
           </w:tcPr>
           <w:p>
             <w:pPr>
@@ -598,7 +681,7 @@
         <w:tc>
           <w:tcPr>
             <w:tcW w:type="dxa" w:w="9638"/>
-            <w:gridSpan w:val="3"/>
+            <w:gridSpan w:val="4"/>
           </w:tcPr>
           <w:p>
             <w:pPr>
@@ -634,13 +717,33 @@
                 <w:i w:val="0"/>
                 <w:sz w:val="20"/>
               </w:rPr>
-              <w:t>Module No. 4: &lt;Title of module 4&gt; (CO's: &lt;CO1, CO2&gt;)</w:t>
-            </w:r>
-          </w:p>
-        </w:tc>
-        <w:tc>
-          <w:tcPr>
-            <w:tcW w:type="dxa" w:w="3277"/>
+              <w:t>Module No. 4: &lt;Title of module 4&gt;</w:t>
+            </w:r>
+          </w:p>
+        </w:tc>
+        <w:tc>
+          <w:tcPr>
+            <w:tcW w:type="dxa" w:w="1735"/>
+          </w:tcPr>
+          <w:p>
+            <w:pPr>
+              <w:spacing w:after="20" w:before="20"/>
+              <w:jc w:val="center"/>
+            </w:pPr>
+            <w:r/>
+            <w:r>
+              <w:rPr>
+                <w:b w:val="0"/>
+                <w:i w:val="0"/>
+                <w:sz w:val="20"/>
+              </w:rPr>
+              <w:t>&lt;CO1&gt;, &lt;CO2&gt;</w:t>
+            </w:r>
+          </w:p>
+        </w:tc>
+        <w:tc>
+          <w:tcPr>
+            <w:tcW w:type="dxa" w:w="1542"/>
           </w:tcPr>
           <w:p>
             <w:pPr>
@@ -662,7 +765,7 @@
         <w:tc>
           <w:tcPr>
             <w:tcW w:type="dxa" w:w="9638"/>
-            <w:gridSpan w:val="3"/>
+            <w:gridSpan w:val="4"/>
           </w:tcPr>
           <w:p>
             <w:pPr>
@@ -698,13 +801,33 @@
                 <w:i w:val="0"/>
                 <w:sz w:val="20"/>
               </w:rPr>
-              <w:t>Module No. 5: &lt;Title of module 5&gt; (CO's: &lt;CO1, CO2&gt;)</w:t>
-            </w:r>
-          </w:p>
-        </w:tc>
-        <w:tc>
-          <w:tcPr>
-            <w:tcW w:type="dxa" w:w="3277"/>
+              <w:t>Module No. 5: &lt;Title of module 5&gt;</w:t>
+            </w:r>
+          </w:p>
+        </w:tc>
+        <w:tc>
+          <w:tcPr>
+            <w:tcW w:type="dxa" w:w="1735"/>
+          </w:tcPr>
+          <w:p>
+            <w:pPr>
+              <w:spacing w:after="20" w:before="20"/>
+              <w:jc w:val="center"/>
+            </w:pPr>
+            <w:r/>
+            <w:r>
+              <w:rPr>
+                <w:b w:val="0"/>
+                <w:i w:val="0"/>
+                <w:sz w:val="20"/>
+              </w:rPr>
+              <w:t>&lt;CO1&gt;, &lt;CO2&gt;</w:t>
+            </w:r>
+          </w:p>
+        </w:tc>
+        <w:tc>
+          <w:tcPr>
+            <w:tcW w:type="dxa" w:w="1542"/>
           </w:tcPr>
           <w:p>
             <w:pPr>
@@ -726,7 +849,7 @@
         <w:tc>
           <w:tcPr>
             <w:tcW w:type="dxa" w:w="9638"/>
-            <w:gridSpan w:val="3"/>
+            <w:gridSpan w:val="4"/>
           </w:tcPr>
           <w:p>
             <w:pPr>
@@ -749,7 +872,7 @@
         <w:tc>
           <w:tcPr>
             <w:tcW w:type="dxa" w:w="9638"/>
-            <w:gridSpan w:val="3"/>
+            <w:gridSpan w:val="4"/>
           </w:tcPr>
           <w:p>
             <w:pPr>
@@ -794,7 +917,7 @@
         <w:tc>
           <w:tcPr>
             <w:tcW w:type="dxa" w:w="9638"/>
-            <w:gridSpan w:val="3"/>
+            <w:gridSpan w:val="4"/>
           </w:tcPr>
           <w:p>
             <w:pPr>

</xml_diff>